<commit_message>
Improve AI job recommendations and pagination
</commit_message>
<xml_diff>
--- a/deliverables/Offer捕手_方案说明.docx
+++ b/deliverables/Offer捕手_方案说明.docx
@@ -79,7 +79,7 @@
         <w:spacing w:after="120" w:line="276" w:lineRule="auto"/>
       </w:pPr>
       <w:r>
-        <w:t>1. 岗位猎手：从简历技能、项目和经历中推荐求职关键词，调用腾讯招聘公开接口搜集最新岗位，并提供多平台检索入口。</w:t>
+        <w:t>1. 岗位猎手：调用 AI 阅读简历，推荐更细分的岗位方向；同时调用腾讯招聘公开接口分页搜集最新岗位，并提供多公司、多平台检索入口。</w:t>
       </w:r>
     </w:p>
     <w:p>
@@ -151,7 +151,7 @@
         <w:spacing w:after="120" w:line="276" w:lineRule="auto"/>
       </w:pPr>
       <w:r>
-        <w:t>第一版完成 JD 解码、简历诊断、面试准备三模块；第二版增强提示词、隐私提示、错误处理和雷达图校验；第三版补充岗位猎手，让 Demo 能从简历出发推荐方向并搜集最新职位。</w:t>
+        <w:t>第一版完成 JD 解码、简历诊断、面试准备三模块；第二版增强提示词、隐私提示、错误处理和雷达图校验；第三版补充岗位猎手，让 Demo 能从简历出发推荐细分方向并分页搜集最新职位。</w:t>
       </w:r>
     </w:p>
     <w:p>

</xml_diff>